<commit_message>
Add company stamp to all 11 NCTC-ATCC equivalence statements
</commit_message>
<xml_diff>
--- a/statements/01_Staphylococcus_aureus_NCTC10788.docx
+++ b/statements/01_Staphylococcus_aureus_NCTC10788.docx
@@ -767,12 +767,13 @@
           </w:tcPr>
           <w:p>
             <w:pPr>
-              <w:jc w:val="left"/>
+              <w:jc w:val="center"/>
             </w:pPr>
+            <w:r/>
             <w:r>
               <w:drawing>
                 <wp:inline xmlns:a="http://schemas.openxmlformats.org/drawingml/2006/main" xmlns:pic="http://schemas.openxmlformats.org/drawingml/2006/picture">
-                  <wp:extent cx="1620000" cy="1620000"/>
+                  <wp:extent cx="1645920" cy="1625190"/>
                   <wp:docPr id="1" name="Picture 1"/>
                   <wp:cNvGraphicFramePr>
                     <a:graphicFrameLocks noChangeAspect="1"/>
@@ -781,11 +782,11 @@
                     <a:graphicData uri="http://schemas.openxmlformats.org/drawingml/2006/picture">
                       <pic:pic>
                         <pic:nvPicPr>
-                          <pic:cNvPr id="0" name="lotustech_stamp.png"/>
+                          <pic:cNvPr id="0" name="LotusTech_stamp_transparent.png"/>
                           <pic:cNvPicPr/>
                         </pic:nvPicPr>
                         <pic:blipFill>
-                          <a:blip r:embed="rId9"/>
+                          <a:blip r:embed="rId10"/>
                           <a:stretch>
                             <a:fillRect/>
                           </a:stretch>
@@ -793,7 +794,7 @@
                         <pic:spPr>
                           <a:xfrm>
                             <a:off x="0" y="0"/>
-                            <a:ext cx="1620000" cy="1620000"/>
+                            <a:ext cx="1645920" cy="1625190"/>
                           </a:xfrm>
                           <a:prstGeom prst="rect"/>
                         </pic:spPr>

</xml_diff>